<commit_message>
Children DOB: intake + token map + patch trust/wills
</commit_message>
<xml_diff>
--- a/templates/canonical/packet_split/will_client1.docx
+++ b/templates/canonical/packet_split/will_client1.docx
@@ -159,7 +159,7 @@
         <w:jc w:val="center"/>
       </w:pPr>
       <w:r>
-        <w:t>[[CHILD1FULLNAME]], born January 1, 2000</w:t>
+        <w:t>[[CHILD1FULLNAME]], born [[CHILD1DOB]]</w:t>
       </w:r>
     </w:p>
     <w:p>
@@ -171,7 +171,7 @@
         <w:jc w:val="center"/>
       </w:pPr>
       <w:r>
-        <w:t>[[CHILD2FULLNAME]], born February 2, 2002</w:t>
+        <w:t>[[CHILD2FULLNAME]], born [[CHILD2DOB]]</w:t>
       </w:r>
     </w:p>
     <w:p>

</xml_diff>